<commit_message>
feat: add independent complex-script font overrides
</commit_message>
<xml_diff>
--- a/tests/fixtures/style-defs.docx
+++ b/tests/fixtures/style-defs.docx
@@ -39,6 +39,14 @@
     <w:p>
       <w:r>
         <w:t xml:space="preserve">A second section heading, sharing the Heading 1 style.</w:t>
+      </w:r>
+    </w:p>
+    <w:p>
+      <w:r>
+        <w:rPr>
+          <w:rFonts w:ascii="Arial" w:hAnsi="Arial" w:cs="Amiri"/>
+        </w:rPr>
+        <w:t xml:space="preserve">Arabic sample: مرحبا بالعالم</w:t>
       </w:r>
     </w:p>
     <w:sectPr>
@@ -84,7 +92,7 @@
       <w:outlineLvl w:val="0"/>
     </w:pPr>
     <w:rPr>
-      <w:rFonts w:asciiTheme="majorHAnsi" w:hAnsiTheme="majorHAnsi" w:cstheme="majorBidi" w:eastAsia="SimHei"/>
+      <w:rFonts w:asciiTheme="majorHAnsi" w:hAnsiTheme="majorHAnsi" w:eastAsia="SimHei" w:cs="Amiri"/>
       <w:b/>
       <w:color w:val="1F3864"/>
       <w:sz w:val="26"/>

</xml_diff>

<commit_message>
Add independent East Asian and complex-script font controls (#7)
* Add --font-east-asia flag to set w:eastAsia independently of --font

--font only ever wrote w:ascii/w:hAnsi/w:cs on <w:rFonts>, so it had no
effect on CJK glyph rendering, which Word resolves through w:eastAsia
(or its w:eastAsiaTheme fallback) instead. This adds a new
applyRunFontEastAsia helper (set-formatting.ts, styles.tsx) plumbed
through the shared RunFormat/parse-helpers pipeline so --font-east-asia
works everywhere --font does: edit, edit --batch, replace, replace
--batch, styles set, and styles create. Also surfaces fontEastAsia in
the read --ast schema and docx styles --at --json output so the
write-read loop holds, and adds unit test + fixture coverage.

Fixes #6

* feat: add independent complex-script font overrides

---------

Co-authored-by: Kirill Klimuk <kklimuk@gmail.com>
</commit_message>
<xml_diff>
--- a/tests/fixtures/style-defs.docx
+++ b/tests/fixtures/style-defs.docx
@@ -39,6 +39,14 @@
     <w:p>
       <w:r>
         <w:t xml:space="preserve">A second section heading, sharing the Heading 1 style.</w:t>
+      </w:r>
+    </w:p>
+    <w:p>
+      <w:r>
+        <w:rPr>
+          <w:rFonts w:ascii="Arial" w:hAnsi="Arial" w:cs="Amiri"/>
+        </w:rPr>
+        <w:t xml:space="preserve">Arabic sample: مرحبا بالعالم</w:t>
       </w:r>
     </w:p>
     <w:sectPr>
@@ -84,7 +92,7 @@
       <w:outlineLvl w:val="0"/>
     </w:pPr>
     <w:rPr>
-      <w:rFonts w:asciiTheme="majorHAnsi" w:hAnsiTheme="majorHAnsi" w:cstheme="majorBidi"/>
+      <w:rFonts w:asciiTheme="majorHAnsi" w:hAnsiTheme="majorHAnsi" w:eastAsia="SimHei" w:cs="Amiri"/>
       <w:b/>
       <w:color w:val="1F3864"/>
       <w:sz w:val="26"/>

</xml_diff>